<commit_message>
added hello world multiple times in one line
</commit_message>
<xml_diff>
--- a/Hello Tamba.docx
+++ b/Hello Tamba.docx
@@ -5,6 +5,58 @@
     <w:p>
       <w:r>
         <w:t>Hello</w:t>
+      </w:r>
+      <w:r>
+        <w:t xml:space="preserve"> </w:t>
+      </w:r>
+      <w:r>
+        <w:t>Hello</w:t>
+      </w:r>
+      <w:r>
+        <w:t xml:space="preserve"> </w:t>
+      </w:r>
+      <w:r>
+        <w:t>Hello</w:t>
+      </w:r>
+      <w:r>
+        <w:t xml:space="preserve"> </w:t>
+      </w:r>
+      <w:r>
+        <w:t>Hello Hello Hello</w:t>
+      </w:r>
+      <w:r>
+        <w:t xml:space="preserve"> </w:t>
+      </w:r>
+      <w:r>
+        <w:t>Hello Hello Hello</w:t>
+      </w:r>
+      <w:r>
+        <w:t xml:space="preserve"> </w:t>
+      </w:r>
+      <w:r>
+        <w:t>Hello Hello Hello</w:t>
+      </w:r>
+      <w:r>
+        <w:t xml:space="preserve"> </w:t>
+      </w:r>
+      <w:r>
+        <w:t>Hello Hello Hello</w:t>
+      </w:r>
+      <w:r>
+        <w:t xml:space="preserve"> </w:t>
+      </w:r>
+      <w:r>
+        <w:t>Hello Hello Hello</w:t>
+      </w:r>
+    </w:p>
+    <w:p/>
+    <w:p/>
+    <w:p/>
+    <w:p/>
+    <w:p/>
+    <w:p>
+      <w:r>
+        <w:t xml:space="preserve"> </w:t>
       </w:r>
     </w:p>
     <w:sectPr>

</xml_diff>

<commit_message>
mistakenly removed some text
</commit_message>
<xml_diff>
--- a/Hello Tamba.docx
+++ b/Hello Tamba.docx
@@ -6,50 +6,7 @@
       <w:r>
         <w:t>Hello</w:t>
       </w:r>
-      <w:r>
-        <w:t xml:space="preserve"> </w:t>
-      </w:r>
-      <w:r>
-        <w:t>Hello</w:t>
-      </w:r>
-      <w:r>
-        <w:t xml:space="preserve"> </w:t>
-      </w:r>
-      <w:r>
-        <w:t>Hello</w:t>
-      </w:r>
-      <w:r>
-        <w:t xml:space="preserve"> </w:t>
-      </w:r>
-      <w:r>
-        <w:t>Hello Hello Hello</w:t>
-      </w:r>
-      <w:r>
-        <w:t xml:space="preserve"> </w:t>
-      </w:r>
-      <w:r>
-        <w:t>Hello Hello Hello</w:t>
-      </w:r>
-      <w:r>
-        <w:t xml:space="preserve"> </w:t>
-      </w:r>
-      <w:r>
-        <w:t>Hello Hello Hello</w:t>
-      </w:r>
-      <w:r>
-        <w:t xml:space="preserve"> </w:t>
-      </w:r>
-      <w:r>
-        <w:t>Hello Hello Hello</w:t>
-      </w:r>
-      <w:r>
-        <w:t xml:space="preserve"> </w:t>
-      </w:r>
-      <w:r>
-        <w:t>Hello Hello Hello</w:t>
-      </w:r>
     </w:p>
-    <w:p/>
     <w:p/>
     <w:p/>
     <w:p/>

</xml_diff>